<commit_message>
atualização da aula dia 20/10/2026
</commit_message>
<xml_diff>
--- a/apostila/Apostila Space For Men (Recuperação Automática).docx
+++ b/apostila/Apostila Space For Men (Recuperação Automática).docx
@@ -21591,6 +21591,7 @@
       </w:pPr>
       <w:r>
         <w:rPr>
+          <w:noProof/>
           <w:sz w:val="24"/>
           <w:szCs w:val="24"/>
         </w:rPr>
@@ -21768,6 +21769,7 @@
       </w:pPr>
       <w:r>
         <w:rPr>
+          <w:noProof/>
           <w:sz w:val="24"/>
           <w:szCs w:val="24"/>
         </w:rPr>
@@ -22041,6 +22043,7 @@
       </w:r>
       <w:r>
         <w:rPr>
+          <w:noProof/>
           <w:sz w:val="24"/>
           <w:szCs w:val="24"/>
         </w:rPr>
@@ -22095,6 +22098,7 @@
       </w:pPr>
       <w:r>
         <w:rPr>
+          <w:noProof/>
           <w:sz w:val="24"/>
           <w:szCs w:val="24"/>
         </w:rPr>
@@ -22332,6 +22336,7 @@
       </w:r>
       <w:r>
         <w:rPr>
+          <w:noProof/>
           <w:sz w:val="24"/>
           <w:szCs w:val="24"/>
         </w:rPr>
@@ -22430,9 +22435,9 @@
           <w:szCs w:val="24"/>
         </w:rPr>
       </w:pPr>
-      <w:bookmarkStart w:id="0" w:name="_GoBack"/>
-      <w:r>
-        <w:rPr>
+      <w:r>
+        <w:rPr>
+          <w:noProof/>
           <w:sz w:val="24"/>
           <w:szCs w:val="24"/>
         </w:rPr>
@@ -22472,6 +22477,1795 @@
           </wp:inline>
         </w:drawing>
       </w:r>
+    </w:p>
+    <w:p>
+      <w:pPr>
+        <w:pStyle w:val="PargrafodaLista"/>
+        <w:tabs>
+          <w:tab w:val="left" w:pos="1275"/>
+        </w:tabs>
+        <w:ind w:left="1080"/>
+        <w:rPr>
+          <w:sz w:val="24"/>
+          <w:szCs w:val="24"/>
+        </w:rPr>
+      </w:pPr>
+    </w:p>
+    <w:p>
+      <w:pPr>
+        <w:pStyle w:val="PargrafodaLista"/>
+        <w:tabs>
+          <w:tab w:val="left" w:pos="1275"/>
+        </w:tabs>
+        <w:ind w:left="1080"/>
+        <w:rPr>
+          <w:sz w:val="24"/>
+          <w:szCs w:val="24"/>
+        </w:rPr>
+      </w:pPr>
+    </w:p>
+    <w:p>
+      <w:pPr>
+        <w:pStyle w:val="PargrafodaLista"/>
+        <w:tabs>
+          <w:tab w:val="left" w:pos="1275"/>
+        </w:tabs>
+        <w:ind w:left="1080"/>
+        <w:rPr>
+          <w:sz w:val="24"/>
+          <w:szCs w:val="24"/>
+        </w:rPr>
+      </w:pPr>
+    </w:p>
+    <w:p>
+      <w:pPr>
+        <w:pStyle w:val="PargrafodaLista"/>
+        <w:tabs>
+          <w:tab w:val="left" w:pos="1275"/>
+        </w:tabs>
+        <w:ind w:left="1080"/>
+        <w:rPr>
+          <w:sz w:val="24"/>
+          <w:szCs w:val="24"/>
+        </w:rPr>
+      </w:pPr>
+    </w:p>
+    <w:p>
+      <w:pPr>
+        <w:pStyle w:val="PargrafodaLista"/>
+        <w:tabs>
+          <w:tab w:val="left" w:pos="1275"/>
+        </w:tabs>
+        <w:ind w:left="1080"/>
+        <w:rPr>
+          <w:sz w:val="24"/>
+          <w:szCs w:val="24"/>
+        </w:rPr>
+      </w:pPr>
+    </w:p>
+    <w:p>
+      <w:pPr>
+        <w:pStyle w:val="PargrafodaLista"/>
+        <w:tabs>
+          <w:tab w:val="left" w:pos="1275"/>
+        </w:tabs>
+        <w:ind w:left="1080"/>
+        <w:rPr>
+          <w:sz w:val="24"/>
+          <w:szCs w:val="24"/>
+        </w:rPr>
+      </w:pPr>
+    </w:p>
+    <w:p>
+      <w:pPr>
+        <w:pStyle w:val="PargrafodaLista"/>
+        <w:tabs>
+          <w:tab w:val="left" w:pos="1275"/>
+        </w:tabs>
+        <w:ind w:left="1080"/>
+        <w:rPr>
+          <w:sz w:val="24"/>
+          <w:szCs w:val="24"/>
+        </w:rPr>
+      </w:pPr>
+    </w:p>
+    <w:p>
+      <w:pPr>
+        <w:pStyle w:val="PargrafodaLista"/>
+        <w:tabs>
+          <w:tab w:val="left" w:pos="1275"/>
+        </w:tabs>
+        <w:ind w:left="1080"/>
+        <w:rPr>
+          <w:sz w:val="24"/>
+          <w:szCs w:val="24"/>
+        </w:rPr>
+      </w:pPr>
+    </w:p>
+    <w:p>
+      <w:pPr>
+        <w:pStyle w:val="PargrafodaLista"/>
+        <w:tabs>
+          <w:tab w:val="left" w:pos="1275"/>
+        </w:tabs>
+        <w:ind w:left="1080"/>
+        <w:rPr>
+          <w:sz w:val="24"/>
+          <w:szCs w:val="24"/>
+        </w:rPr>
+      </w:pPr>
+    </w:p>
+    <w:p>
+      <w:pPr>
+        <w:pStyle w:val="PargrafodaLista"/>
+        <w:tabs>
+          <w:tab w:val="left" w:pos="1275"/>
+        </w:tabs>
+        <w:ind w:left="1080"/>
+        <w:rPr>
+          <w:sz w:val="24"/>
+          <w:szCs w:val="24"/>
+        </w:rPr>
+      </w:pPr>
+    </w:p>
+    <w:p>
+      <w:pPr>
+        <w:pStyle w:val="PargrafodaLista"/>
+        <w:tabs>
+          <w:tab w:val="left" w:pos="1275"/>
+        </w:tabs>
+        <w:ind w:left="1080"/>
+        <w:rPr>
+          <w:sz w:val="24"/>
+          <w:szCs w:val="24"/>
+        </w:rPr>
+      </w:pPr>
+    </w:p>
+    <w:p>
+      <w:pPr>
+        <w:pStyle w:val="PargrafodaLista"/>
+        <w:tabs>
+          <w:tab w:val="left" w:pos="1275"/>
+        </w:tabs>
+        <w:ind w:left="1080"/>
+        <w:rPr>
+          <w:sz w:val="24"/>
+          <w:szCs w:val="24"/>
+        </w:rPr>
+      </w:pPr>
+    </w:p>
+    <w:p>
+      <w:pPr>
+        <w:pStyle w:val="PargrafodaLista"/>
+        <w:tabs>
+          <w:tab w:val="left" w:pos="1275"/>
+        </w:tabs>
+        <w:ind w:left="1080"/>
+        <w:rPr>
+          <w:sz w:val="24"/>
+          <w:szCs w:val="24"/>
+        </w:rPr>
+      </w:pPr>
+      <w:r>
+        <w:rPr>
+          <w:sz w:val="24"/>
+          <w:szCs w:val="24"/>
+        </w:rPr>
+        <w:lastRenderedPageBreak/>
+        <w:t xml:space="preserve">102 – Da mesma forma que </w:t>
+      </w:r>
+      <w:r>
+        <w:rPr>
+          <w:sz w:val="24"/>
+          <w:szCs w:val="24"/>
+        </w:rPr>
+        <w:t xml:space="preserve">realizamos no arquivo style.css para deixa a página responsiva  vamos fazer o mesmo código conforme imagem a baixo para deixar a página produto </w:t>
+      </w:r>
+      <w:r>
+        <w:rPr>
+          <w:sz w:val="24"/>
+          <w:szCs w:val="24"/>
+        </w:rPr>
+        <w:t>pronta para ser visualizada pelo celular.</w:t>
+      </w:r>
+    </w:p>
+    <w:p>
+      <w:pPr>
+        <w:pStyle w:val="PargrafodaLista"/>
+        <w:tabs>
+          <w:tab w:val="left" w:pos="1275"/>
+        </w:tabs>
+        <w:ind w:left="1080"/>
+        <w:rPr>
+          <w:sz w:val="24"/>
+          <w:szCs w:val="24"/>
+        </w:rPr>
+      </w:pPr>
+      <w:r>
+        <w:rPr>
+          <w:sz w:val="24"/>
+          <w:szCs w:val="24"/>
+        </w:rPr>
+        <w:drawing>
+          <wp:inline distT="0" distB="0" distL="0" distR="0" wp14:anchorId="3BB185FA" wp14:editId="738117F9">
+            <wp:extent cx="5400040" cy="2117725"/>
+            <wp:effectExtent l="0" t="0" r="0" b="0"/>
+            <wp:docPr id="191" name="Imagem 191"/>
+            <wp:cNvGraphicFramePr>
+              <a:graphicFrameLocks xmlns:a="http://schemas.openxmlformats.org/drawingml/2006/main" noChangeAspect="1"/>
+            </wp:cNvGraphicFramePr>
+            <a:graphic xmlns:a="http://schemas.openxmlformats.org/drawingml/2006/main">
+              <a:graphicData uri="http://schemas.openxmlformats.org/drawingml/2006/picture">
+                <pic:pic xmlns:pic="http://schemas.openxmlformats.org/drawingml/2006/picture">
+                  <pic:nvPicPr>
+                    <pic:cNvPr id="1" name=""/>
+                    <pic:cNvPicPr/>
+                  </pic:nvPicPr>
+                  <pic:blipFill>
+                    <a:blip r:embed="rId153"/>
+                    <a:stretch>
+                      <a:fillRect/>
+                    </a:stretch>
+                  </pic:blipFill>
+                  <pic:spPr>
+                    <a:xfrm>
+                      <a:off x="0" y="0"/>
+                      <a:ext cx="5400040" cy="2117725"/>
+                    </a:xfrm>
+                    <a:prstGeom prst="rect">
+                      <a:avLst/>
+                    </a:prstGeom>
+                  </pic:spPr>
+                </pic:pic>
+              </a:graphicData>
+            </a:graphic>
+          </wp:inline>
+        </w:drawing>
+      </w:r>
+    </w:p>
+    <w:p>
+      <w:pPr>
+        <w:pStyle w:val="PargrafodaLista"/>
+        <w:tabs>
+          <w:tab w:val="left" w:pos="1275"/>
+        </w:tabs>
+        <w:ind w:left="1080"/>
+        <w:rPr>
+          <w:sz w:val="24"/>
+          <w:szCs w:val="24"/>
+        </w:rPr>
+      </w:pPr>
+    </w:p>
+    <w:p>
+      <w:pPr>
+        <w:pStyle w:val="PargrafodaLista"/>
+        <w:tabs>
+          <w:tab w:val="left" w:pos="1275"/>
+        </w:tabs>
+        <w:ind w:left="1080"/>
+        <w:rPr>
+          <w:sz w:val="24"/>
+          <w:szCs w:val="24"/>
+        </w:rPr>
+      </w:pPr>
+      <w:r>
+        <w:rPr>
+          <w:sz w:val="24"/>
+          <w:szCs w:val="24"/>
+        </w:rPr>
+        <w:t xml:space="preserve">103 </w:t>
+      </w:r>
+      <w:r>
+        <w:rPr>
+          <w:sz w:val="24"/>
+          <w:szCs w:val="24"/>
+        </w:rPr>
+        <w:t>–</w:t>
+      </w:r>
+      <w:r>
+        <w:rPr>
+          <w:sz w:val="24"/>
+          <w:szCs w:val="24"/>
+        </w:rPr>
+        <w:t xml:space="preserve"> </w:t>
+      </w:r>
+      <w:r>
+        <w:rPr>
+          <w:sz w:val="24"/>
+          <w:szCs w:val="24"/>
+        </w:rPr>
+        <w:t>Como o menu e mesmo para as três páginas o código para deixar o menu responsivo se repete.</w:t>
+      </w:r>
+    </w:p>
+    <w:p>
+      <w:pPr>
+        <w:pStyle w:val="PargrafodaLista"/>
+        <w:tabs>
+          <w:tab w:val="left" w:pos="1275"/>
+        </w:tabs>
+        <w:ind w:left="1080"/>
+        <w:rPr>
+          <w:sz w:val="24"/>
+          <w:szCs w:val="24"/>
+        </w:rPr>
+      </w:pPr>
+      <w:r>
+        <w:rPr>
+          <w:sz w:val="24"/>
+          <w:szCs w:val="24"/>
+        </w:rPr>
+        <w:drawing>
+          <wp:inline distT="0" distB="0" distL="0" distR="0" wp14:anchorId="7D77DCA8" wp14:editId="46918B79">
+            <wp:extent cx="4829849" cy="3658111"/>
+            <wp:effectExtent l="0" t="0" r="0" b="0"/>
+            <wp:docPr id="192" name="Imagem 192"/>
+            <wp:cNvGraphicFramePr>
+              <a:graphicFrameLocks xmlns:a="http://schemas.openxmlformats.org/drawingml/2006/main" noChangeAspect="1"/>
+            </wp:cNvGraphicFramePr>
+            <a:graphic xmlns:a="http://schemas.openxmlformats.org/drawingml/2006/main">
+              <a:graphicData uri="http://schemas.openxmlformats.org/drawingml/2006/picture">
+                <pic:pic xmlns:pic="http://schemas.openxmlformats.org/drawingml/2006/picture">
+                  <pic:nvPicPr>
+                    <pic:cNvPr id="1" name=""/>
+                    <pic:cNvPicPr/>
+                  </pic:nvPicPr>
+                  <pic:blipFill>
+                    <a:blip r:embed="rId154"/>
+                    <a:stretch>
+                      <a:fillRect/>
+                    </a:stretch>
+                  </pic:blipFill>
+                  <pic:spPr>
+                    <a:xfrm>
+                      <a:off x="0" y="0"/>
+                      <a:ext cx="4829849" cy="3658111"/>
+                    </a:xfrm>
+                    <a:prstGeom prst="rect">
+                      <a:avLst/>
+                    </a:prstGeom>
+                  </pic:spPr>
+                </pic:pic>
+              </a:graphicData>
+            </a:graphic>
+          </wp:inline>
+        </w:drawing>
+      </w:r>
+    </w:p>
+    <w:p>
+      <w:pPr>
+        <w:pStyle w:val="PargrafodaLista"/>
+        <w:tabs>
+          <w:tab w:val="left" w:pos="1275"/>
+        </w:tabs>
+        <w:ind w:left="1080"/>
+        <w:rPr>
+          <w:sz w:val="24"/>
+          <w:szCs w:val="24"/>
+        </w:rPr>
+      </w:pPr>
+    </w:p>
+    <w:p>
+      <w:pPr>
+        <w:pStyle w:val="PargrafodaLista"/>
+        <w:tabs>
+          <w:tab w:val="left" w:pos="1275"/>
+        </w:tabs>
+        <w:ind w:left="1080"/>
+        <w:rPr>
+          <w:sz w:val="24"/>
+          <w:szCs w:val="24"/>
+        </w:rPr>
+      </w:pPr>
+    </w:p>
+    <w:p>
+      <w:pPr>
+        <w:pStyle w:val="PargrafodaLista"/>
+        <w:tabs>
+          <w:tab w:val="left" w:pos="1275"/>
+        </w:tabs>
+        <w:ind w:left="1080"/>
+        <w:rPr>
+          <w:sz w:val="24"/>
+          <w:szCs w:val="24"/>
+        </w:rPr>
+      </w:pPr>
+    </w:p>
+    <w:p>
+      <w:pPr>
+        <w:pStyle w:val="PargrafodaLista"/>
+        <w:tabs>
+          <w:tab w:val="left" w:pos="1275"/>
+        </w:tabs>
+        <w:ind w:left="1080"/>
+        <w:rPr>
+          <w:sz w:val="24"/>
+          <w:szCs w:val="24"/>
+        </w:rPr>
+      </w:pPr>
+    </w:p>
+    <w:p>
+      <w:pPr>
+        <w:pStyle w:val="PargrafodaLista"/>
+        <w:tabs>
+          <w:tab w:val="left" w:pos="1275"/>
+        </w:tabs>
+        <w:ind w:left="1080"/>
+        <w:rPr>
+          <w:sz w:val="24"/>
+          <w:szCs w:val="24"/>
+        </w:rPr>
+      </w:pPr>
+    </w:p>
+    <w:p>
+      <w:pPr>
+        <w:pStyle w:val="PargrafodaLista"/>
+        <w:tabs>
+          <w:tab w:val="left" w:pos="1275"/>
+        </w:tabs>
+        <w:ind w:left="1080"/>
+        <w:rPr>
+          <w:sz w:val="24"/>
+          <w:szCs w:val="24"/>
+        </w:rPr>
+      </w:pPr>
+    </w:p>
+    <w:p>
+      <w:pPr>
+        <w:pStyle w:val="PargrafodaLista"/>
+        <w:tabs>
+          <w:tab w:val="left" w:pos="1275"/>
+        </w:tabs>
+        <w:ind w:left="1080"/>
+        <w:rPr>
+          <w:sz w:val="24"/>
+          <w:szCs w:val="24"/>
+        </w:rPr>
+      </w:pPr>
+    </w:p>
+    <w:p>
+      <w:pPr>
+        <w:pStyle w:val="PargrafodaLista"/>
+        <w:tabs>
+          <w:tab w:val="left" w:pos="1275"/>
+        </w:tabs>
+        <w:ind w:left="1080"/>
+        <w:rPr>
+          <w:sz w:val="24"/>
+          <w:szCs w:val="24"/>
+        </w:rPr>
+      </w:pPr>
+    </w:p>
+    <w:p>
+      <w:pPr>
+        <w:pStyle w:val="PargrafodaLista"/>
+        <w:tabs>
+          <w:tab w:val="left" w:pos="1275"/>
+        </w:tabs>
+        <w:ind w:left="1080"/>
+        <w:rPr>
+          <w:sz w:val="24"/>
+          <w:szCs w:val="24"/>
+        </w:rPr>
+      </w:pPr>
+    </w:p>
+    <w:p>
+      <w:pPr>
+        <w:pStyle w:val="PargrafodaLista"/>
+        <w:tabs>
+          <w:tab w:val="left" w:pos="1275"/>
+        </w:tabs>
+        <w:ind w:left="1080"/>
+        <w:rPr>
+          <w:sz w:val="24"/>
+          <w:szCs w:val="24"/>
+        </w:rPr>
+      </w:pPr>
+      <w:r>
+        <w:rPr>
+          <w:sz w:val="24"/>
+          <w:szCs w:val="24"/>
+        </w:rPr>
+        <w:lastRenderedPageBreak/>
+        <w:t xml:space="preserve">104 </w:t>
+      </w:r>
+      <w:r>
+        <w:rPr>
+          <w:sz w:val="24"/>
+          <w:szCs w:val="24"/>
+        </w:rPr>
+        <w:t>–</w:t>
+      </w:r>
+      <w:r>
+        <w:rPr>
+          <w:sz w:val="24"/>
+          <w:szCs w:val="24"/>
+        </w:rPr>
+        <w:t xml:space="preserve"> </w:t>
+      </w:r>
+      <w:r>
+        <w:rPr>
+          <w:sz w:val="24"/>
+          <w:szCs w:val="24"/>
+        </w:rPr>
+        <w:t xml:space="preserve">Na </w:t>
+      </w:r>
+      <w:proofErr w:type="spellStart"/>
+      <w:r>
+        <w:rPr>
+          <w:sz w:val="24"/>
+          <w:szCs w:val="24"/>
+        </w:rPr>
+        <w:t>class</w:t>
+      </w:r>
+      <w:proofErr w:type="spellEnd"/>
+      <w:r>
+        <w:rPr>
+          <w:sz w:val="24"/>
+          <w:szCs w:val="24"/>
+        </w:rPr>
+        <w:t xml:space="preserve"> .produtos </w:t>
+      </w:r>
+      <w:r>
+        <w:rPr>
+          <w:sz w:val="24"/>
+          <w:szCs w:val="24"/>
+        </w:rPr>
+        <w:t>colocamos os seguintes códigos:</w:t>
+      </w:r>
+    </w:p>
+    <w:p>
+      <w:pPr>
+        <w:pStyle w:val="PargrafodaLista"/>
+        <w:numPr>
+          <w:ilvl w:val="0"/>
+          <w:numId w:val="4"/>
+        </w:numPr>
+        <w:tabs>
+          <w:tab w:val="left" w:pos="1275"/>
+        </w:tabs>
+        <w:rPr>
+          <w:sz w:val="24"/>
+          <w:szCs w:val="24"/>
+        </w:rPr>
+      </w:pPr>
+      <w:r>
+        <w:rPr>
+          <w:sz w:val="24"/>
+          <w:szCs w:val="24"/>
+        </w:rPr>
+        <w:t>Produto aparecer 100% da tela em largura</w:t>
+      </w:r>
+    </w:p>
+    <w:p>
+      <w:pPr>
+        <w:pStyle w:val="PargrafodaLista"/>
+        <w:numPr>
+          <w:ilvl w:val="0"/>
+          <w:numId w:val="4"/>
+        </w:numPr>
+        <w:tabs>
+          <w:tab w:val="left" w:pos="1275"/>
+        </w:tabs>
+        <w:rPr>
+          <w:sz w:val="24"/>
+          <w:szCs w:val="24"/>
+        </w:rPr>
+      </w:pPr>
+      <w:r>
+        <w:rPr>
+          <w:sz w:val="24"/>
+          <w:szCs w:val="24"/>
+        </w:rPr>
+        <w:t>Aumentamos o espaço interno 10px para todos os lados</w:t>
+      </w:r>
+    </w:p>
+    <w:p>
+      <w:pPr>
+        <w:pStyle w:val="PargrafodaLista"/>
+        <w:numPr>
+          <w:ilvl w:val="0"/>
+          <w:numId w:val="4"/>
+        </w:numPr>
+        <w:tabs>
+          <w:tab w:val="left" w:pos="1275"/>
+        </w:tabs>
+        <w:rPr>
+          <w:sz w:val="24"/>
+          <w:szCs w:val="24"/>
+        </w:rPr>
+      </w:pPr>
+      <w:r>
+        <w:rPr>
+          <w:sz w:val="24"/>
+          <w:szCs w:val="24"/>
+        </w:rPr>
+        <w:t>Ao colocar box-</w:t>
+      </w:r>
+      <w:proofErr w:type="spellStart"/>
+      <w:r>
+        <w:rPr>
+          <w:sz w:val="24"/>
+          <w:szCs w:val="24"/>
+        </w:rPr>
+        <w:t>sizing</w:t>
+      </w:r>
+      <w:proofErr w:type="spellEnd"/>
+      <w:r>
+        <w:rPr>
+          <w:sz w:val="24"/>
+          <w:szCs w:val="24"/>
+        </w:rPr>
+        <w:t xml:space="preserve"> : não contamos o tamanho da borda </w:t>
+      </w:r>
+    </w:p>
+    <w:p>
+      <w:pPr>
+        <w:pStyle w:val="PargrafodaLista"/>
+        <w:tabs>
+          <w:tab w:val="left" w:pos="1275"/>
+        </w:tabs>
+        <w:ind w:left="1080"/>
+        <w:rPr>
+          <w:sz w:val="24"/>
+          <w:szCs w:val="24"/>
+        </w:rPr>
+      </w:pPr>
+    </w:p>
+    <w:p>
+      <w:pPr>
+        <w:pStyle w:val="PargrafodaLista"/>
+        <w:tabs>
+          <w:tab w:val="left" w:pos="1275"/>
+        </w:tabs>
+        <w:ind w:left="1080"/>
+        <w:rPr>
+          <w:sz w:val="24"/>
+          <w:szCs w:val="24"/>
+        </w:rPr>
+      </w:pPr>
+      <w:r>
+        <w:rPr>
+          <w:sz w:val="24"/>
+          <w:szCs w:val="24"/>
+        </w:rPr>
+        <w:drawing>
+          <wp:inline distT="0" distB="0" distL="0" distR="0" wp14:anchorId="28F419E3" wp14:editId="04C82D84">
+            <wp:extent cx="3734321" cy="1819529"/>
+            <wp:effectExtent l="0" t="0" r="0" b="9525"/>
+            <wp:docPr id="194" name="Imagem 194"/>
+            <wp:cNvGraphicFramePr>
+              <a:graphicFrameLocks xmlns:a="http://schemas.openxmlformats.org/drawingml/2006/main" noChangeAspect="1"/>
+            </wp:cNvGraphicFramePr>
+            <a:graphic xmlns:a="http://schemas.openxmlformats.org/drawingml/2006/main">
+              <a:graphicData uri="http://schemas.openxmlformats.org/drawingml/2006/picture">
+                <pic:pic xmlns:pic="http://schemas.openxmlformats.org/drawingml/2006/picture">
+                  <pic:nvPicPr>
+                    <pic:cNvPr id="1" name=""/>
+                    <pic:cNvPicPr/>
+                  </pic:nvPicPr>
+                  <pic:blipFill>
+                    <a:blip r:embed="rId155"/>
+                    <a:stretch>
+                      <a:fillRect/>
+                    </a:stretch>
+                  </pic:blipFill>
+                  <pic:spPr>
+                    <a:xfrm>
+                      <a:off x="0" y="0"/>
+                      <a:ext cx="3734321" cy="1819529"/>
+                    </a:xfrm>
+                    <a:prstGeom prst="rect">
+                      <a:avLst/>
+                    </a:prstGeom>
+                  </pic:spPr>
+                </pic:pic>
+              </a:graphicData>
+            </a:graphic>
+          </wp:inline>
+        </w:drawing>
+      </w:r>
+    </w:p>
+    <w:p>
+      <w:pPr>
+        <w:pStyle w:val="PargrafodaLista"/>
+        <w:tabs>
+          <w:tab w:val="left" w:pos="1275"/>
+        </w:tabs>
+        <w:ind w:left="1080"/>
+        <w:rPr>
+          <w:sz w:val="24"/>
+          <w:szCs w:val="24"/>
+        </w:rPr>
+      </w:pPr>
+    </w:p>
+    <w:p>
+      <w:pPr>
+        <w:pStyle w:val="PargrafodaLista"/>
+        <w:tabs>
+          <w:tab w:val="left" w:pos="1275"/>
+        </w:tabs>
+        <w:ind w:left="1080"/>
+        <w:rPr>
+          <w:sz w:val="24"/>
+          <w:szCs w:val="24"/>
+        </w:rPr>
+      </w:pPr>
+    </w:p>
+    <w:p>
+      <w:pPr>
+        <w:pStyle w:val="PargrafodaLista"/>
+        <w:tabs>
+          <w:tab w:val="left" w:pos="1275"/>
+        </w:tabs>
+        <w:ind w:left="1080"/>
+        <w:rPr>
+          <w:sz w:val="24"/>
+          <w:szCs w:val="24"/>
+        </w:rPr>
+      </w:pPr>
+      <w:r>
+        <w:rPr>
+          <w:sz w:val="24"/>
+          <w:szCs w:val="24"/>
+        </w:rPr>
+        <w:t xml:space="preserve">105 – Na </w:t>
+      </w:r>
+      <w:proofErr w:type="spellStart"/>
+      <w:r>
+        <w:rPr>
+          <w:sz w:val="24"/>
+          <w:szCs w:val="24"/>
+        </w:rPr>
+        <w:t>class</w:t>
+      </w:r>
+      <w:proofErr w:type="spellEnd"/>
+      <w:r>
+        <w:rPr>
+          <w:sz w:val="24"/>
+          <w:szCs w:val="24"/>
+        </w:rPr>
+        <w:t xml:space="preserve"> .produtos li deixamos</w:t>
+      </w:r>
+    </w:p>
+    <w:p>
+      <w:pPr>
+        <w:pStyle w:val="PargrafodaLista"/>
+        <w:numPr>
+          <w:ilvl w:val="0"/>
+          <w:numId w:val="4"/>
+        </w:numPr>
+        <w:tabs>
+          <w:tab w:val="left" w:pos="1275"/>
+        </w:tabs>
+        <w:rPr>
+          <w:sz w:val="24"/>
+          <w:szCs w:val="24"/>
+        </w:rPr>
+      </w:pPr>
+      <w:r>
+        <w:rPr>
+          <w:sz w:val="24"/>
+          <w:szCs w:val="24"/>
+        </w:rPr>
+        <w:t>Cada item de produtos ficar um em baixo do outro</w:t>
+      </w:r>
+    </w:p>
+    <w:p>
+      <w:pPr>
+        <w:pStyle w:val="PargrafodaLista"/>
+        <w:numPr>
+          <w:ilvl w:val="0"/>
+          <w:numId w:val="4"/>
+        </w:numPr>
+        <w:tabs>
+          <w:tab w:val="left" w:pos="1275"/>
+        </w:tabs>
+        <w:rPr>
+          <w:sz w:val="24"/>
+          <w:szCs w:val="24"/>
+        </w:rPr>
+      </w:pPr>
+      <w:r>
+        <w:rPr>
+          <w:sz w:val="24"/>
+          <w:szCs w:val="24"/>
+        </w:rPr>
+        <w:t>Cada item do produto aparecer na tela do celular com 100</w:t>
+      </w:r>
+      <w:r>
+        <w:rPr>
+          <w:sz w:val="24"/>
+          <w:szCs w:val="24"/>
+        </w:rPr>
+        <w:t>% de largura</w:t>
+      </w:r>
+    </w:p>
+    <w:p>
+      <w:pPr>
+        <w:pStyle w:val="PargrafodaLista"/>
+        <w:numPr>
+          <w:ilvl w:val="0"/>
+          <w:numId w:val="4"/>
+        </w:numPr>
+        <w:tabs>
+          <w:tab w:val="left" w:pos="1275"/>
+        </w:tabs>
+        <w:rPr>
+          <w:sz w:val="24"/>
+          <w:szCs w:val="24"/>
+        </w:rPr>
+      </w:pPr>
+      <w:r>
+        <w:rPr>
+          <w:sz w:val="24"/>
+          <w:szCs w:val="24"/>
+        </w:rPr>
+        <w:t>Demos um espaço externo tanto para cima como para baixo de 10px</w:t>
+      </w:r>
+    </w:p>
+    <w:p>
+      <w:pPr>
+        <w:pStyle w:val="PargrafodaLista"/>
+        <w:numPr>
+          <w:ilvl w:val="0"/>
+          <w:numId w:val="4"/>
+        </w:numPr>
+        <w:tabs>
+          <w:tab w:val="left" w:pos="1275"/>
+        </w:tabs>
+        <w:rPr>
+          <w:sz w:val="24"/>
+          <w:szCs w:val="24"/>
+        </w:rPr>
+      </w:pPr>
+      <w:r>
+        <w:rPr>
+          <w:sz w:val="24"/>
+          <w:szCs w:val="24"/>
+        </w:rPr>
+        <w:t xml:space="preserve">E </w:t>
+      </w:r>
+      <w:r>
+        <w:rPr>
+          <w:sz w:val="24"/>
+          <w:szCs w:val="24"/>
+        </w:rPr>
+        <w:t>utilizamos</w:t>
+      </w:r>
+      <w:r>
+        <w:rPr>
+          <w:sz w:val="24"/>
+          <w:szCs w:val="24"/>
+        </w:rPr>
+        <w:t xml:space="preserve"> box-</w:t>
+      </w:r>
+      <w:proofErr w:type="spellStart"/>
+      <w:r>
+        <w:rPr>
+          <w:sz w:val="24"/>
+          <w:szCs w:val="24"/>
+        </w:rPr>
+        <w:t>si</w:t>
+      </w:r>
+      <w:r>
+        <w:rPr>
+          <w:sz w:val="24"/>
+          <w:szCs w:val="24"/>
+        </w:rPr>
+        <w:t>zing</w:t>
+      </w:r>
+      <w:proofErr w:type="spellEnd"/>
+      <w:r>
+        <w:rPr>
+          <w:sz w:val="24"/>
+          <w:szCs w:val="24"/>
+        </w:rPr>
+        <w:t xml:space="preserve"> para não contar o valor da borda.</w:t>
+      </w:r>
+    </w:p>
+    <w:p>
+      <w:pPr>
+        <w:pStyle w:val="PargrafodaLista"/>
+        <w:tabs>
+          <w:tab w:val="left" w:pos="1275"/>
+        </w:tabs>
+        <w:ind w:left="1080"/>
+        <w:rPr>
+          <w:sz w:val="24"/>
+          <w:szCs w:val="24"/>
+        </w:rPr>
+      </w:pPr>
+      <w:r>
+        <w:rPr>
+          <w:sz w:val="24"/>
+          <w:szCs w:val="24"/>
+        </w:rPr>
+        <w:drawing>
+          <wp:inline distT="0" distB="0" distL="0" distR="0" wp14:anchorId="4F0446B6" wp14:editId="35978AF3">
+            <wp:extent cx="3238952" cy="1952898"/>
+            <wp:effectExtent l="0" t="0" r="0" b="9525"/>
+            <wp:docPr id="195" name="Imagem 195"/>
+            <wp:cNvGraphicFramePr>
+              <a:graphicFrameLocks xmlns:a="http://schemas.openxmlformats.org/drawingml/2006/main" noChangeAspect="1"/>
+            </wp:cNvGraphicFramePr>
+            <a:graphic xmlns:a="http://schemas.openxmlformats.org/drawingml/2006/main">
+              <a:graphicData uri="http://schemas.openxmlformats.org/drawingml/2006/picture">
+                <pic:pic xmlns:pic="http://schemas.openxmlformats.org/drawingml/2006/picture">
+                  <pic:nvPicPr>
+                    <pic:cNvPr id="1" name=""/>
+                    <pic:cNvPicPr/>
+                  </pic:nvPicPr>
+                  <pic:blipFill>
+                    <a:blip r:embed="rId156"/>
+                    <a:stretch>
+                      <a:fillRect/>
+                    </a:stretch>
+                  </pic:blipFill>
+                  <pic:spPr>
+                    <a:xfrm>
+                      <a:off x="0" y="0"/>
+                      <a:ext cx="3238952" cy="1952898"/>
+                    </a:xfrm>
+                    <a:prstGeom prst="rect">
+                      <a:avLst/>
+                    </a:prstGeom>
+                  </pic:spPr>
+                </pic:pic>
+              </a:graphicData>
+            </a:graphic>
+          </wp:inline>
+        </w:drawing>
+      </w:r>
+    </w:p>
+    <w:p>
+      <w:pPr>
+        <w:pStyle w:val="PargrafodaLista"/>
+        <w:tabs>
+          <w:tab w:val="left" w:pos="1275"/>
+        </w:tabs>
+        <w:ind w:left="1080"/>
+        <w:rPr>
+          <w:sz w:val="24"/>
+          <w:szCs w:val="24"/>
+        </w:rPr>
+      </w:pPr>
+    </w:p>
+    <w:p>
+      <w:pPr>
+        <w:pStyle w:val="PargrafodaLista"/>
+        <w:tabs>
+          <w:tab w:val="left" w:pos="1275"/>
+        </w:tabs>
+        <w:ind w:left="1080"/>
+        <w:rPr>
+          <w:sz w:val="24"/>
+          <w:szCs w:val="24"/>
+        </w:rPr>
+      </w:pPr>
+    </w:p>
+    <w:p>
+      <w:pPr>
+        <w:pStyle w:val="PargrafodaLista"/>
+        <w:tabs>
+          <w:tab w:val="left" w:pos="1275"/>
+        </w:tabs>
+        <w:ind w:left="1080"/>
+        <w:rPr>
+          <w:sz w:val="24"/>
+          <w:szCs w:val="24"/>
+        </w:rPr>
+      </w:pPr>
+    </w:p>
+    <w:p>
+      <w:pPr>
+        <w:pStyle w:val="PargrafodaLista"/>
+        <w:tabs>
+          <w:tab w:val="left" w:pos="1275"/>
+        </w:tabs>
+        <w:ind w:left="1080"/>
+        <w:rPr>
+          <w:sz w:val="24"/>
+          <w:szCs w:val="24"/>
+        </w:rPr>
+      </w:pPr>
+    </w:p>
+    <w:p>
+      <w:pPr>
+        <w:pStyle w:val="PargrafodaLista"/>
+        <w:tabs>
+          <w:tab w:val="left" w:pos="1275"/>
+        </w:tabs>
+        <w:ind w:left="1080"/>
+        <w:rPr>
+          <w:sz w:val="24"/>
+          <w:szCs w:val="24"/>
+        </w:rPr>
+      </w:pPr>
+    </w:p>
+    <w:p>
+      <w:pPr>
+        <w:pStyle w:val="PargrafodaLista"/>
+        <w:tabs>
+          <w:tab w:val="left" w:pos="1275"/>
+        </w:tabs>
+        <w:ind w:left="1080"/>
+        <w:rPr>
+          <w:sz w:val="24"/>
+          <w:szCs w:val="24"/>
+        </w:rPr>
+      </w:pPr>
+    </w:p>
+    <w:p>
+      <w:pPr>
+        <w:pStyle w:val="PargrafodaLista"/>
+        <w:tabs>
+          <w:tab w:val="left" w:pos="1275"/>
+        </w:tabs>
+        <w:ind w:left="1080"/>
+        <w:rPr>
+          <w:sz w:val="24"/>
+          <w:szCs w:val="24"/>
+        </w:rPr>
+      </w:pPr>
+    </w:p>
+    <w:p>
+      <w:pPr>
+        <w:pStyle w:val="PargrafodaLista"/>
+        <w:tabs>
+          <w:tab w:val="left" w:pos="1275"/>
+        </w:tabs>
+        <w:ind w:left="1080"/>
+        <w:rPr>
+          <w:sz w:val="24"/>
+          <w:szCs w:val="24"/>
+        </w:rPr>
+      </w:pPr>
+    </w:p>
+    <w:p>
+      <w:pPr>
+        <w:pStyle w:val="PargrafodaLista"/>
+        <w:tabs>
+          <w:tab w:val="left" w:pos="1275"/>
+        </w:tabs>
+        <w:ind w:left="1080"/>
+        <w:rPr>
+          <w:sz w:val="24"/>
+          <w:szCs w:val="24"/>
+        </w:rPr>
+      </w:pPr>
+    </w:p>
+    <w:p>
+      <w:pPr>
+        <w:pStyle w:val="PargrafodaLista"/>
+        <w:tabs>
+          <w:tab w:val="left" w:pos="1275"/>
+        </w:tabs>
+        <w:ind w:left="1080"/>
+        <w:rPr>
+          <w:sz w:val="24"/>
+          <w:szCs w:val="24"/>
+        </w:rPr>
+      </w:pPr>
+    </w:p>
+    <w:p>
+      <w:pPr>
+        <w:pStyle w:val="PargrafodaLista"/>
+        <w:tabs>
+          <w:tab w:val="left" w:pos="1275"/>
+        </w:tabs>
+        <w:ind w:left="1080"/>
+        <w:rPr>
+          <w:sz w:val="24"/>
+          <w:szCs w:val="24"/>
+        </w:rPr>
+      </w:pPr>
+    </w:p>
+    <w:p>
+      <w:pPr>
+        <w:pStyle w:val="PargrafodaLista"/>
+        <w:tabs>
+          <w:tab w:val="left" w:pos="1275"/>
+        </w:tabs>
+        <w:ind w:left="1080"/>
+        <w:rPr>
+          <w:sz w:val="24"/>
+          <w:szCs w:val="24"/>
+        </w:rPr>
+      </w:pPr>
+    </w:p>
+    <w:p>
+      <w:pPr>
+        <w:pStyle w:val="PargrafodaLista"/>
+        <w:tabs>
+          <w:tab w:val="left" w:pos="1275"/>
+        </w:tabs>
+        <w:ind w:left="1080"/>
+        <w:rPr>
+          <w:sz w:val="24"/>
+          <w:szCs w:val="24"/>
+        </w:rPr>
+      </w:pPr>
+    </w:p>
+    <w:p>
+      <w:pPr>
+        <w:pStyle w:val="PargrafodaLista"/>
+        <w:tabs>
+          <w:tab w:val="left" w:pos="1275"/>
+        </w:tabs>
+        <w:ind w:left="1080"/>
+        <w:rPr>
+          <w:sz w:val="24"/>
+          <w:szCs w:val="24"/>
+        </w:rPr>
+      </w:pPr>
+      <w:r>
+        <w:rPr>
+          <w:sz w:val="24"/>
+          <w:szCs w:val="24"/>
+        </w:rPr>
+        <w:lastRenderedPageBreak/>
+        <w:t xml:space="preserve">106- </w:t>
+      </w:r>
+      <w:r>
+        <w:rPr>
+          <w:sz w:val="24"/>
+          <w:szCs w:val="24"/>
+        </w:rPr>
+        <w:t>Na</w:t>
+      </w:r>
+      <w:r>
+        <w:rPr>
+          <w:sz w:val="24"/>
+          <w:szCs w:val="24"/>
+        </w:rPr>
+        <w:t xml:space="preserve"> </w:t>
+      </w:r>
+      <w:r>
+        <w:rPr>
+          <w:sz w:val="24"/>
+          <w:szCs w:val="24"/>
+        </w:rPr>
+        <w:t>página</w:t>
+      </w:r>
+      <w:r>
+        <w:rPr>
+          <w:sz w:val="24"/>
+          <w:szCs w:val="24"/>
+        </w:rPr>
+        <w:t xml:space="preserve"> dos contatos para deixar responsiva </w:t>
+      </w:r>
+      <w:r>
+        <w:rPr>
+          <w:sz w:val="24"/>
+          <w:szCs w:val="24"/>
+        </w:rPr>
+        <w:t>colocamos os seguintes códigos:</w:t>
+      </w:r>
+    </w:p>
+    <w:p>
+      <w:pPr>
+        <w:pStyle w:val="PargrafodaLista"/>
+        <w:tabs>
+          <w:tab w:val="left" w:pos="1275"/>
+        </w:tabs>
+        <w:ind w:left="1080"/>
+        <w:rPr>
+          <w:sz w:val="24"/>
+          <w:szCs w:val="24"/>
+        </w:rPr>
+      </w:pPr>
+    </w:p>
+    <w:p>
+      <w:pPr>
+        <w:pStyle w:val="PargrafodaLista"/>
+        <w:numPr>
+          <w:ilvl w:val="0"/>
+          <w:numId w:val="4"/>
+        </w:numPr>
+        <w:tabs>
+          <w:tab w:val="left" w:pos="1275"/>
+        </w:tabs>
+        <w:rPr>
+          <w:sz w:val="24"/>
+          <w:szCs w:val="24"/>
+        </w:rPr>
+      </w:pPr>
+      <w:r>
+        <w:rPr>
+          <w:sz w:val="24"/>
+          <w:szCs w:val="24"/>
+        </w:rPr>
+        <w:t xml:space="preserve">Deixamos o menu responsivo utilizando o código </w:t>
+      </w:r>
+      <w:r>
+        <w:rPr>
+          <w:sz w:val="24"/>
+          <w:szCs w:val="24"/>
+        </w:rPr>
+        <w:t>anterior das páginas index.html e produtos.html</w:t>
+      </w:r>
+    </w:p>
+    <w:p>
+      <w:pPr>
+        <w:pStyle w:val="PargrafodaLista"/>
+        <w:tabs>
+          <w:tab w:val="left" w:pos="1275"/>
+        </w:tabs>
+        <w:rPr>
+          <w:sz w:val="24"/>
+          <w:szCs w:val="24"/>
+        </w:rPr>
+      </w:pPr>
+    </w:p>
+    <w:p>
+      <w:pPr>
+        <w:pStyle w:val="PargrafodaLista"/>
+        <w:tabs>
+          <w:tab w:val="left" w:pos="1275"/>
+        </w:tabs>
+        <w:rPr>
+          <w:sz w:val="24"/>
+          <w:szCs w:val="24"/>
+        </w:rPr>
+      </w:pPr>
+      <w:r>
+        <w:rPr>
+          <w:sz w:val="24"/>
+          <w:szCs w:val="24"/>
+        </w:rPr>
+        <w:drawing>
+          <wp:inline distT="0" distB="0" distL="0" distR="0" wp14:anchorId="50DF9EB0" wp14:editId="7A1CBEE6">
+            <wp:extent cx="4477375" cy="3362794"/>
+            <wp:effectExtent l="0" t="0" r="0" b="9525"/>
+            <wp:docPr id="196" name="Imagem 196"/>
+            <wp:cNvGraphicFramePr>
+              <a:graphicFrameLocks xmlns:a="http://schemas.openxmlformats.org/drawingml/2006/main" noChangeAspect="1"/>
+            </wp:cNvGraphicFramePr>
+            <a:graphic xmlns:a="http://schemas.openxmlformats.org/drawingml/2006/main">
+              <a:graphicData uri="http://schemas.openxmlformats.org/drawingml/2006/picture">
+                <pic:pic xmlns:pic="http://schemas.openxmlformats.org/drawingml/2006/picture">
+                  <pic:nvPicPr>
+                    <pic:cNvPr id="1" name=""/>
+                    <pic:cNvPicPr/>
+                  </pic:nvPicPr>
+                  <pic:blipFill>
+                    <a:blip r:embed="rId157"/>
+                    <a:stretch>
+                      <a:fillRect/>
+                    </a:stretch>
+                  </pic:blipFill>
+                  <pic:spPr>
+                    <a:xfrm>
+                      <a:off x="0" y="0"/>
+                      <a:ext cx="4477375" cy="3362794"/>
+                    </a:xfrm>
+                    <a:prstGeom prst="rect">
+                      <a:avLst/>
+                    </a:prstGeom>
+                  </pic:spPr>
+                </pic:pic>
+              </a:graphicData>
+            </a:graphic>
+          </wp:inline>
+        </w:drawing>
+      </w:r>
+    </w:p>
+    <w:p>
+      <w:pPr>
+        <w:pStyle w:val="PargrafodaLista"/>
+        <w:tabs>
+          <w:tab w:val="left" w:pos="1275"/>
+        </w:tabs>
+        <w:rPr>
+          <w:sz w:val="24"/>
+          <w:szCs w:val="24"/>
+        </w:rPr>
+      </w:pPr>
+    </w:p>
+    <w:p>
+      <w:pPr>
+        <w:pStyle w:val="PargrafodaLista"/>
+        <w:tabs>
+          <w:tab w:val="left" w:pos="1275"/>
+        </w:tabs>
+        <w:rPr>
+          <w:sz w:val="24"/>
+          <w:szCs w:val="24"/>
+        </w:rPr>
+      </w:pPr>
+      <w:r>
+        <w:rPr>
+          <w:sz w:val="24"/>
+          <w:szCs w:val="24"/>
+        </w:rPr>
+        <w:t xml:space="preserve">107 – No </w:t>
+      </w:r>
+      <w:proofErr w:type="spellStart"/>
+      <w:r>
+        <w:rPr>
+          <w:sz w:val="24"/>
+          <w:szCs w:val="24"/>
+        </w:rPr>
+        <w:t>main</w:t>
+      </w:r>
+      <w:proofErr w:type="spellEnd"/>
+      <w:r>
+        <w:rPr>
+          <w:sz w:val="24"/>
+          <w:szCs w:val="24"/>
+        </w:rPr>
+        <w:t xml:space="preserve"> onde se encontra o formulário deixamos que a largura seja automática e demos um espaço interno para esquerda conforme código</w:t>
+      </w:r>
+    </w:p>
+    <w:p>
+      <w:pPr>
+        <w:pStyle w:val="PargrafodaLista"/>
+        <w:tabs>
+          <w:tab w:val="left" w:pos="1275"/>
+        </w:tabs>
+        <w:rPr>
+          <w:sz w:val="24"/>
+          <w:szCs w:val="24"/>
+        </w:rPr>
+      </w:pPr>
+      <w:r>
+        <w:rPr>
+          <w:sz w:val="24"/>
+          <w:szCs w:val="24"/>
+        </w:rPr>
+        <w:drawing>
+          <wp:inline distT="0" distB="0" distL="0" distR="0" wp14:anchorId="3A75EAC8" wp14:editId="75429E5B">
+            <wp:extent cx="3743847" cy="1476581"/>
+            <wp:effectExtent l="0" t="0" r="9525" b="9525"/>
+            <wp:docPr id="197" name="Imagem 197"/>
+            <wp:cNvGraphicFramePr>
+              <a:graphicFrameLocks xmlns:a="http://schemas.openxmlformats.org/drawingml/2006/main" noChangeAspect="1"/>
+            </wp:cNvGraphicFramePr>
+            <a:graphic xmlns:a="http://schemas.openxmlformats.org/drawingml/2006/main">
+              <a:graphicData uri="http://schemas.openxmlformats.org/drawingml/2006/picture">
+                <pic:pic xmlns:pic="http://schemas.openxmlformats.org/drawingml/2006/picture">
+                  <pic:nvPicPr>
+                    <pic:cNvPr id="1" name=""/>
+                    <pic:cNvPicPr/>
+                  </pic:nvPicPr>
+                  <pic:blipFill>
+                    <a:blip r:embed="rId158"/>
+                    <a:stretch>
+                      <a:fillRect/>
+                    </a:stretch>
+                  </pic:blipFill>
+                  <pic:spPr>
+                    <a:xfrm>
+                      <a:off x="0" y="0"/>
+                      <a:ext cx="3743847" cy="1476581"/>
+                    </a:xfrm>
+                    <a:prstGeom prst="rect">
+                      <a:avLst/>
+                    </a:prstGeom>
+                  </pic:spPr>
+                </pic:pic>
+              </a:graphicData>
+            </a:graphic>
+          </wp:inline>
+        </w:drawing>
+      </w:r>
+    </w:p>
+    <w:p>
+      <w:pPr>
+        <w:pStyle w:val="PargrafodaLista"/>
+        <w:tabs>
+          <w:tab w:val="left" w:pos="1275"/>
+        </w:tabs>
+        <w:rPr>
+          <w:sz w:val="24"/>
+          <w:szCs w:val="24"/>
+        </w:rPr>
+      </w:pPr>
+    </w:p>
+    <w:p>
+      <w:pPr>
+        <w:pStyle w:val="PargrafodaLista"/>
+        <w:tabs>
+          <w:tab w:val="left" w:pos="1275"/>
+        </w:tabs>
+        <w:rPr>
+          <w:sz w:val="24"/>
+          <w:szCs w:val="24"/>
+        </w:rPr>
+      </w:pPr>
+    </w:p>
+    <w:p>
+      <w:pPr>
+        <w:pStyle w:val="PargrafodaLista"/>
+        <w:tabs>
+          <w:tab w:val="left" w:pos="1275"/>
+        </w:tabs>
+        <w:rPr>
+          <w:sz w:val="24"/>
+          <w:szCs w:val="24"/>
+        </w:rPr>
+      </w:pPr>
+    </w:p>
+    <w:p>
+      <w:pPr>
+        <w:pStyle w:val="PargrafodaLista"/>
+        <w:tabs>
+          <w:tab w:val="left" w:pos="1275"/>
+        </w:tabs>
+        <w:rPr>
+          <w:sz w:val="24"/>
+          <w:szCs w:val="24"/>
+        </w:rPr>
+      </w:pPr>
+    </w:p>
+    <w:p>
+      <w:pPr>
+        <w:pStyle w:val="PargrafodaLista"/>
+        <w:tabs>
+          <w:tab w:val="left" w:pos="1275"/>
+        </w:tabs>
+        <w:rPr>
+          <w:sz w:val="24"/>
+          <w:szCs w:val="24"/>
+        </w:rPr>
+      </w:pPr>
+    </w:p>
+    <w:p>
+      <w:pPr>
+        <w:pStyle w:val="PargrafodaLista"/>
+        <w:tabs>
+          <w:tab w:val="left" w:pos="1275"/>
+        </w:tabs>
+        <w:rPr>
+          <w:sz w:val="24"/>
+          <w:szCs w:val="24"/>
+        </w:rPr>
+      </w:pPr>
+    </w:p>
+    <w:p>
+      <w:pPr>
+        <w:pStyle w:val="PargrafodaLista"/>
+        <w:tabs>
+          <w:tab w:val="left" w:pos="1275"/>
+        </w:tabs>
+        <w:rPr>
+          <w:sz w:val="24"/>
+          <w:szCs w:val="24"/>
+        </w:rPr>
+      </w:pPr>
+    </w:p>
+    <w:p>
+      <w:pPr>
+        <w:pStyle w:val="PargrafodaLista"/>
+        <w:tabs>
+          <w:tab w:val="left" w:pos="1275"/>
+        </w:tabs>
+        <w:rPr>
+          <w:sz w:val="24"/>
+          <w:szCs w:val="24"/>
+        </w:rPr>
+      </w:pPr>
+    </w:p>
+    <w:p>
+      <w:pPr>
+        <w:pStyle w:val="PargrafodaLista"/>
+        <w:tabs>
+          <w:tab w:val="left" w:pos="1275"/>
+        </w:tabs>
+        <w:rPr>
+          <w:sz w:val="24"/>
+          <w:szCs w:val="24"/>
+        </w:rPr>
+      </w:pPr>
+    </w:p>
+    <w:p>
+      <w:pPr>
+        <w:pStyle w:val="PargrafodaLista"/>
+        <w:tabs>
+          <w:tab w:val="left" w:pos="1275"/>
+        </w:tabs>
+        <w:rPr>
+          <w:sz w:val="24"/>
+          <w:szCs w:val="24"/>
+        </w:rPr>
+      </w:pPr>
+    </w:p>
+    <w:p>
+      <w:pPr>
+        <w:pStyle w:val="PargrafodaLista"/>
+        <w:tabs>
+          <w:tab w:val="left" w:pos="1275"/>
+        </w:tabs>
+        <w:rPr>
+          <w:sz w:val="24"/>
+          <w:szCs w:val="24"/>
+        </w:rPr>
+      </w:pPr>
+      <w:r>
+        <w:rPr>
+          <w:sz w:val="24"/>
+          <w:szCs w:val="24"/>
+        </w:rPr>
+        <w:lastRenderedPageBreak/>
+        <w:t>108- No input deixamos da seguinte forma</w:t>
+      </w:r>
+    </w:p>
+    <w:p>
+      <w:pPr>
+        <w:pStyle w:val="PargrafodaLista"/>
+        <w:numPr>
+          <w:ilvl w:val="0"/>
+          <w:numId w:val="4"/>
+        </w:numPr>
+        <w:tabs>
+          <w:tab w:val="left" w:pos="1275"/>
+        </w:tabs>
+        <w:rPr>
+          <w:sz w:val="24"/>
+          <w:szCs w:val="24"/>
+        </w:rPr>
+      </w:pPr>
+      <w:r>
+        <w:rPr>
+          <w:sz w:val="24"/>
+          <w:szCs w:val="24"/>
+        </w:rPr>
+        <w:t xml:space="preserve">Para cada item do inputs-padrão ocupasse </w:t>
+      </w:r>
+      <w:r>
+        <w:rPr>
+          <w:sz w:val="24"/>
+          <w:szCs w:val="24"/>
+        </w:rPr>
+        <w:t>90% de largura</w:t>
+      </w:r>
+    </w:p>
+    <w:p>
+      <w:pPr>
+        <w:pStyle w:val="PargrafodaLista"/>
+        <w:numPr>
+          <w:ilvl w:val="0"/>
+          <w:numId w:val="4"/>
+        </w:numPr>
+        <w:tabs>
+          <w:tab w:val="left" w:pos="1275"/>
+        </w:tabs>
+        <w:rPr>
+          <w:sz w:val="24"/>
+          <w:szCs w:val="24"/>
+        </w:rPr>
+      </w:pPr>
+      <w:r>
+        <w:rPr>
+          <w:sz w:val="24"/>
+          <w:szCs w:val="24"/>
+        </w:rPr>
+        <w:t xml:space="preserve">   E demos um espaço interno para todos os lados de 10px</w:t>
+      </w:r>
+      <w:r>
+        <w:rPr>
+          <w:sz w:val="24"/>
+          <w:szCs w:val="24"/>
+        </w:rPr>
+        <w:t xml:space="preserve"> </w:t>
+      </w:r>
+    </w:p>
+    <w:p>
+      <w:pPr>
+        <w:pStyle w:val="PargrafodaLista"/>
+        <w:tabs>
+          <w:tab w:val="left" w:pos="1275"/>
+        </w:tabs>
+        <w:rPr>
+          <w:sz w:val="24"/>
+          <w:szCs w:val="24"/>
+        </w:rPr>
+      </w:pPr>
+      <w:r>
+        <w:rPr>
+          <w:sz w:val="24"/>
+          <w:szCs w:val="24"/>
+        </w:rPr>
+        <w:drawing>
+          <wp:inline distT="0" distB="0" distL="0" distR="0" wp14:anchorId="55AC1B50" wp14:editId="5C3D6F36">
+            <wp:extent cx="3096057" cy="1514686"/>
+            <wp:effectExtent l="0" t="0" r="9525" b="9525"/>
+            <wp:docPr id="198" name="Imagem 198"/>
+            <wp:cNvGraphicFramePr>
+              <a:graphicFrameLocks xmlns:a="http://schemas.openxmlformats.org/drawingml/2006/main" noChangeAspect="1"/>
+            </wp:cNvGraphicFramePr>
+            <a:graphic xmlns:a="http://schemas.openxmlformats.org/drawingml/2006/main">
+              <a:graphicData uri="http://schemas.openxmlformats.org/drawingml/2006/picture">
+                <pic:pic xmlns:pic="http://schemas.openxmlformats.org/drawingml/2006/picture">
+                  <pic:nvPicPr>
+                    <pic:cNvPr id="1" name=""/>
+                    <pic:cNvPicPr/>
+                  </pic:nvPicPr>
+                  <pic:blipFill>
+                    <a:blip r:embed="rId159"/>
+                    <a:stretch>
+                      <a:fillRect/>
+                    </a:stretch>
+                  </pic:blipFill>
+                  <pic:spPr>
+                    <a:xfrm>
+                      <a:off x="0" y="0"/>
+                      <a:ext cx="3096057" cy="1514686"/>
+                    </a:xfrm>
+                    <a:prstGeom prst="rect">
+                      <a:avLst/>
+                    </a:prstGeom>
+                  </pic:spPr>
+                </pic:pic>
+              </a:graphicData>
+            </a:graphic>
+          </wp:inline>
+        </w:drawing>
+      </w:r>
+    </w:p>
+    <w:p>
+      <w:pPr>
+        <w:pStyle w:val="PargrafodaLista"/>
+        <w:tabs>
+          <w:tab w:val="left" w:pos="1275"/>
+        </w:tabs>
+        <w:rPr>
+          <w:sz w:val="24"/>
+          <w:szCs w:val="24"/>
+        </w:rPr>
+      </w:pPr>
+    </w:p>
+    <w:p>
+      <w:pPr>
+        <w:pStyle w:val="PargrafodaLista"/>
+        <w:tabs>
+          <w:tab w:val="left" w:pos="1275"/>
+        </w:tabs>
+        <w:rPr>
+          <w:sz w:val="24"/>
+          <w:szCs w:val="24"/>
+        </w:rPr>
+      </w:pPr>
+      <w:r>
+        <w:rPr>
+          <w:sz w:val="24"/>
+          <w:szCs w:val="24"/>
+        </w:rPr>
+        <w:t xml:space="preserve">109 </w:t>
+      </w:r>
+      <w:r>
+        <w:rPr>
+          <w:sz w:val="24"/>
+          <w:szCs w:val="24"/>
+        </w:rPr>
+        <w:t>–</w:t>
+      </w:r>
+      <w:r>
+        <w:rPr>
+          <w:sz w:val="24"/>
+          <w:szCs w:val="24"/>
+        </w:rPr>
+        <w:t xml:space="preserve"> </w:t>
+      </w:r>
+      <w:r>
+        <w:rPr>
+          <w:sz w:val="24"/>
+          <w:szCs w:val="24"/>
+        </w:rPr>
+        <w:t>No botão enviar fico da seguinte forma:</w:t>
+      </w:r>
+    </w:p>
+    <w:p>
+      <w:pPr>
+        <w:pStyle w:val="PargrafodaLista"/>
+        <w:numPr>
+          <w:ilvl w:val="0"/>
+          <w:numId w:val="4"/>
+        </w:numPr>
+        <w:tabs>
+          <w:tab w:val="left" w:pos="1275"/>
+        </w:tabs>
+        <w:rPr>
+          <w:sz w:val="24"/>
+          <w:szCs w:val="24"/>
+        </w:rPr>
+      </w:pPr>
+      <w:r>
+        <w:rPr>
+          <w:sz w:val="24"/>
+          <w:szCs w:val="24"/>
+        </w:rPr>
+        <w:t>Demos um</w:t>
+      </w:r>
+      <w:r>
+        <w:rPr>
+          <w:sz w:val="24"/>
+          <w:szCs w:val="24"/>
+        </w:rPr>
+        <w:t>a</w:t>
+      </w:r>
+      <w:r>
+        <w:rPr>
+          <w:sz w:val="24"/>
+          <w:szCs w:val="24"/>
+        </w:rPr>
+        <w:t xml:space="preserve"> largura para o botão de 80</w:t>
+      </w:r>
+      <w:r>
+        <w:rPr>
+          <w:sz w:val="24"/>
+          <w:szCs w:val="24"/>
+        </w:rPr>
+        <w:t>%</w:t>
+      </w:r>
+      <w:r>
+        <w:rPr>
+          <w:sz w:val="24"/>
+          <w:szCs w:val="24"/>
+        </w:rPr>
+        <w:t xml:space="preserve"> </w:t>
+      </w:r>
+      <w:r>
+        <w:rPr>
+          <w:sz w:val="24"/>
+          <w:szCs w:val="24"/>
+        </w:rPr>
+        <w:tab/>
+      </w:r>
+    </w:p>
+    <w:p>
+      <w:pPr>
+        <w:pStyle w:val="PargrafodaLista"/>
+        <w:numPr>
+          <w:ilvl w:val="0"/>
+          <w:numId w:val="4"/>
+        </w:numPr>
+        <w:tabs>
+          <w:tab w:val="left" w:pos="1275"/>
+        </w:tabs>
+        <w:rPr>
+          <w:sz w:val="24"/>
+          <w:szCs w:val="24"/>
+        </w:rPr>
+      </w:pPr>
+      <w:r>
+        <w:rPr>
+          <w:sz w:val="24"/>
+          <w:szCs w:val="24"/>
+        </w:rPr>
+        <w:t>Aumentamos o espaço interno de 15px para todos os lados</w:t>
+      </w:r>
+    </w:p>
+    <w:p>
+      <w:pPr>
+        <w:pStyle w:val="PargrafodaLista"/>
+        <w:numPr>
+          <w:ilvl w:val="0"/>
+          <w:numId w:val="4"/>
+        </w:numPr>
+        <w:tabs>
+          <w:tab w:val="left" w:pos="1275"/>
+        </w:tabs>
+        <w:rPr>
+          <w:sz w:val="24"/>
+          <w:szCs w:val="24"/>
+        </w:rPr>
+      </w:pPr>
+      <w:r>
+        <w:rPr>
+          <w:sz w:val="24"/>
+          <w:szCs w:val="24"/>
+        </w:rPr>
+        <w:t>Aumentamos o tamanho da fonte para 1</w:t>
+      </w:r>
+      <w:r>
+        <w:rPr>
+          <w:sz w:val="24"/>
+          <w:szCs w:val="24"/>
+        </w:rPr>
+        <w:t xml:space="preserve">6px </w:t>
+      </w:r>
+      <w:bookmarkStart w:id="0" w:name="_GoBack"/>
       <w:bookmarkEnd w:id="0"/>
     </w:p>
     <w:p>
@@ -22480,12 +24274,156 @@
         <w:tabs>
           <w:tab w:val="left" w:pos="1275"/>
         </w:tabs>
+        <w:rPr>
+          <w:sz w:val="24"/>
+          <w:szCs w:val="24"/>
+        </w:rPr>
+      </w:pPr>
+    </w:p>
+    <w:p>
+      <w:pPr>
+        <w:pStyle w:val="PargrafodaLista"/>
+        <w:tabs>
+          <w:tab w:val="left" w:pos="1275"/>
+        </w:tabs>
+        <w:rPr>
+          <w:sz w:val="24"/>
+          <w:szCs w:val="24"/>
+        </w:rPr>
+      </w:pPr>
+      <w:r>
+        <w:rPr>
+          <w:sz w:val="24"/>
+          <w:szCs w:val="24"/>
+        </w:rPr>
+        <w:drawing>
+          <wp:inline distT="0" distB="0" distL="0" distR="0" wp14:anchorId="6FB4BB31" wp14:editId="00CB1F1E">
+            <wp:extent cx="3315163" cy="1667108"/>
+            <wp:effectExtent l="0" t="0" r="0" b="9525"/>
+            <wp:docPr id="200" name="Imagem 200"/>
+            <wp:cNvGraphicFramePr>
+              <a:graphicFrameLocks xmlns:a="http://schemas.openxmlformats.org/drawingml/2006/main" noChangeAspect="1"/>
+            </wp:cNvGraphicFramePr>
+            <a:graphic xmlns:a="http://schemas.openxmlformats.org/drawingml/2006/main">
+              <a:graphicData uri="http://schemas.openxmlformats.org/drawingml/2006/picture">
+                <pic:pic xmlns:pic="http://schemas.openxmlformats.org/drawingml/2006/picture">
+                  <pic:nvPicPr>
+                    <pic:cNvPr id="1" name=""/>
+                    <pic:cNvPicPr/>
+                  </pic:nvPicPr>
+                  <pic:blipFill>
+                    <a:blip r:embed="rId160"/>
+                    <a:stretch>
+                      <a:fillRect/>
+                    </a:stretch>
+                  </pic:blipFill>
+                  <pic:spPr>
+                    <a:xfrm>
+                      <a:off x="0" y="0"/>
+                      <a:ext cx="3315163" cy="1667108"/>
+                    </a:xfrm>
+                    <a:prstGeom prst="rect">
+                      <a:avLst/>
+                    </a:prstGeom>
+                  </pic:spPr>
+                </pic:pic>
+              </a:graphicData>
+            </a:graphic>
+          </wp:inline>
+        </w:drawing>
+      </w:r>
+    </w:p>
+    <w:p>
+      <w:pPr>
+        <w:pStyle w:val="PargrafodaLista"/>
+        <w:tabs>
+          <w:tab w:val="left" w:pos="1275"/>
+        </w:tabs>
         <w:ind w:left="1080"/>
         <w:rPr>
           <w:sz w:val="24"/>
           <w:szCs w:val="24"/>
         </w:rPr>
       </w:pPr>
+    </w:p>
+    <w:p>
+      <w:pPr>
+        <w:pStyle w:val="PargrafodaLista"/>
+        <w:tabs>
+          <w:tab w:val="left" w:pos="1275"/>
+        </w:tabs>
+        <w:ind w:left="1080"/>
+        <w:rPr>
+          <w:sz w:val="24"/>
+          <w:szCs w:val="24"/>
+        </w:rPr>
+      </w:pPr>
+    </w:p>
+    <w:p>
+      <w:pPr>
+        <w:pStyle w:val="PargrafodaLista"/>
+        <w:tabs>
+          <w:tab w:val="left" w:pos="1275"/>
+        </w:tabs>
+        <w:ind w:left="1080"/>
+        <w:rPr>
+          <w:sz w:val="24"/>
+          <w:szCs w:val="24"/>
+        </w:rPr>
+      </w:pPr>
+    </w:p>
+    <w:p>
+      <w:pPr>
+        <w:pStyle w:val="PargrafodaLista"/>
+        <w:tabs>
+          <w:tab w:val="left" w:pos="1275"/>
+        </w:tabs>
+        <w:ind w:left="1080"/>
+        <w:rPr>
+          <w:sz w:val="24"/>
+          <w:szCs w:val="24"/>
+        </w:rPr>
+      </w:pPr>
+    </w:p>
+    <w:p>
+      <w:pPr>
+        <w:pStyle w:val="PargrafodaLista"/>
+        <w:tabs>
+          <w:tab w:val="left" w:pos="1275"/>
+        </w:tabs>
+        <w:ind w:left="1080"/>
+        <w:rPr>
+          <w:sz w:val="24"/>
+          <w:szCs w:val="24"/>
+        </w:rPr>
+      </w:pPr>
+    </w:p>
+    <w:p>
+      <w:pPr>
+        <w:pStyle w:val="PargrafodaLista"/>
+        <w:tabs>
+          <w:tab w:val="left" w:pos="1275"/>
+        </w:tabs>
+        <w:ind w:left="1080"/>
+        <w:rPr>
+          <w:sz w:val="24"/>
+          <w:szCs w:val="24"/>
+        </w:rPr>
+      </w:pPr>
+      <w:r>
+        <w:rPr>
+          <w:sz w:val="24"/>
+          <w:szCs w:val="24"/>
+        </w:rPr>
+        <w:t xml:space="preserve"> </w:t>
+      </w:r>
+      <w:r>
+        <w:rPr>
+          <w:sz w:val="24"/>
+          <w:szCs w:val="24"/>
+        </w:rPr>
+        <w:tab/>
+      </w:r>
     </w:p>
     <w:p>
       <w:pPr>
@@ -23938,7 +25876,7 @@
 </file>
 
 <file path=customXml/itemProps1.xml><?xml version="1.0" encoding="utf-8"?>
-<ds:datastoreItem xmlns:ds="http://schemas.openxmlformats.org/officeDocument/2006/customXml" ds:itemID="{7B0724FC-A1EE-4E44-9F27-D44B96B6C4B2}">
+<ds:datastoreItem xmlns:ds="http://schemas.openxmlformats.org/officeDocument/2006/customXml" ds:itemID="{1C7B8DBC-D28D-478C-AB7F-C465534DFB87}">
   <ds:schemaRefs>
     <ds:schemaRef ds:uri="http://schemas.openxmlformats.org/officeDocument/2006/bibliography"/>
   </ds:schemaRefs>

</xml_diff>